<commit_message>
test(domain): specify numbered lists, over-long words and pages of split chunks
Review findings 10, 11 and 13. A numbered list outside an article joins
its paragraph, inside an article each number starts a paragraph; a word
longer than the limit is cut; each part of a split chunk gets the page
it starts on. The Word fixture gains a numbered list.

Refs: F-02
Co-Authored-By: Claude Opus 5.5 <noreply@anthropic.com>
</commit_message>
<xml_diff>
--- a/backend/tests/fixtures/documents/retention-policy.docx
+++ b/backend/tests/fixtures/documents/retention-policy.docx
@@ -104,6 +104,35 @@
         </w:tc>
       </w:tr>
     </w:tbl>
+    <w:p>
+      <w:pPr>
+        <w:pStyle w:val="Heading2"/>
+      </w:pPr>
+      <w:r>
+        <w:t>Backups</w:t>
+      </w:r>
+    </w:p>
+    <w:p>
+      <w:r>
+        <w:t>The team shall:</w:t>
+      </w:r>
+    </w:p>
+    <w:p>
+      <w:pPr>
+        <w:pStyle w:val="ListNumber"/>
+      </w:pPr>
+      <w:r>
+        <w:t>back up the logs every week;</w:t>
+      </w:r>
+    </w:p>
+    <w:p>
+      <w:pPr>
+        <w:pStyle w:val="ListNumber"/>
+      </w:pPr>
+      <w:r>
+        <w:t>test a restore every month.</w:t>
+      </w:r>
+    </w:p>
     <w:p>
       <w:pPr>
         <w:pStyle w:val="Heading2"/>

</xml_diff>